<commit_message>
cleanup before adding presenter code
</commit_message>
<xml_diff>
--- a/help/SlideQuestionSpecs.docx
+++ b/help/SlideQuestionSpecs.docx
@@ -547,28 +547,30 @@
           <w:b/>
           <w:bCs/>
         </w:rPr>
-        <w:t xml:space="preserve">and </w:t>
-      </w:r>
-      <w:r>
-        <w:rPr>
-          <w:b/>
-          <w:bCs/>
-        </w:rPr>
-        <w:t>close parenthesis</w:t>
-      </w:r>
-      <w:r>
-        <w:rPr>
-          <w:b/>
-          <w:bCs/>
-        </w:rPr>
-        <w:t xml:space="preserve"> </w:t>
-      </w:r>
-      <w:r>
-        <w:rPr>
-          <w:b/>
-          <w:bCs/>
-        </w:rPr>
-        <w:t>on each of the possible answers, such as A) B) C) D)…. (avoid putting commas inside each answer)</w:t>
+        <w:t xml:space="preserve">and close parenthesis </w:t>
+      </w:r>
+      <w:r>
+        <w:rPr>
+          <w:b/>
+          <w:bCs/>
+        </w:rPr>
+        <w:t xml:space="preserve">on each of the possible answers, such as A) B) C) </w:t>
+      </w:r>
+      <w:proofErr w:type="gramStart"/>
+      <w:r>
+        <w:rPr>
+          <w:b/>
+          <w:bCs/>
+        </w:rPr>
+        <w:t>D)…</w:t>
+      </w:r>
+      <w:proofErr w:type="gramEnd"/>
+      <w:r>
+        <w:rPr>
+          <w:b/>
+          <w:bCs/>
+        </w:rPr>
+        <w:t>. (avoid putting commas inside each answer)</w:t>
       </w:r>
       <w:r>
         <w:rPr>
@@ -576,7 +578,13 @@
           <w:bCs/>
         </w:rPr>
         <w:br/>
-        <w:t>randomize the sequence of the correct answer.</w:t>
+      </w:r>
+      <w:r>
+        <w:rPr>
+          <w:b/>
+          <w:bCs/>
+        </w:rPr>
+        <w:t>randomize the sequence of the correct answer include all the letters used about the same number of times.</w:t>
       </w:r>
     </w:p>
     <w:p>
@@ -619,14 +627,7 @@
           <w:b/>
           <w:bCs/>
         </w:rPr>
-        <w:t>close parenthesis</w:t>
-      </w:r>
-      <w:r>
-        <w:rPr>
-          <w:b/>
-          <w:bCs/>
-        </w:rPr>
-        <w:t xml:space="preserve"> </w:t>
+        <w:t xml:space="preserve">close parenthesis </w:t>
       </w:r>
       <w:r>
         <w:rPr>

</xml_diff>